<commit_message>
Actualización masiva: resultados, documentación, PDFs y scripts nuevos
</commit_message>
<xml_diff>
--- a/publicaciones/La Teoría del Miedo Inteligente.docx
+++ b/publicaciones/La Teoría del Miedo Inteligente.docx
@@ -9,14 +9,6 @@
           <w:bCs/>
         </w:rPr>
       </w:pPr>
-      <w:r>
-        <w:rPr>
-          <w:rFonts w:ascii="Segoe UI Emoji" w:hAnsi="Segoe UI Emoji" w:cs="Segoe UI Emoji"/>
-          <w:b/>
-          <w:bCs/>
-        </w:rPr>
-        <w:t>🧠</w:t>
-      </w:r>
       <w:r>
         <w:rPr>
           <w:b/>
@@ -80,21 +72,12 @@
       <w:r>
         <w:br/>
       </w:r>
-      <w:proofErr w:type="spellStart"/>
-      <w:r>
-        <w:rPr>
-          <w:b/>
-          <w:bCs/>
-        </w:rPr>
-        <w:t>Zenodo</w:t>
-      </w:r>
-      <w:proofErr w:type="spellEnd"/>
-      <w:r>
-        <w:rPr>
-          <w:b/>
-          <w:bCs/>
-        </w:rPr>
-        <w:t xml:space="preserve"> (TUI v4.2):</w:t>
+      <w:r>
+        <w:rPr>
+          <w:b/>
+          <w:bCs/>
+        </w:rPr>
+        <w:t>Zenodo (TUI v4.2):</w:t>
       </w:r>
       <w:r>
         <w:t xml:space="preserve"> </w:t>
@@ -124,7 +107,7 @@
     <w:p>
       <w:r>
         <w:pict w14:anchorId="5A721C0F">
-          <v:rect id="_x0000_i1067" style="width:0;height:1.5pt" o:hralign="center" o:hrstd="t" o:hr="t" fillcolor="#a0a0a0" stroked="f"/>
+          <v:rect id="_x0000_i1025" style="width:0;height:1.5pt" o:hralign="center" o:hrstd="t" o:hr="t" fillcolor="#a0a0a0" stroked="f"/>
         </w:pict>
       </w:r>
     </w:p>
@@ -145,33 +128,12 @@
     </w:p>
     <w:p>
       <w:r>
-        <w:t xml:space="preserve">Las </w:t>
-      </w:r>
-      <w:proofErr w:type="spellStart"/>
-      <w:r>
-        <w:t>IAs</w:t>
-      </w:r>
-      <w:proofErr w:type="spellEnd"/>
-      <w:r>
-        <w:t xml:space="preserve"> actuales, como </w:t>
-      </w:r>
-      <w:proofErr w:type="spellStart"/>
-      <w:r>
-        <w:t>ChatGPT</w:t>
-      </w:r>
-      <w:proofErr w:type="spellEnd"/>
-      <w:r>
-        <w:t>, son impresionantes: escriben código, redactan ensayos, responden exámenes y manejan cantidades colosales de información. Su Capacidad (C) estadística es enorme.</w:t>
-      </w:r>
-    </w:p>
-    <w:p>
-      <w:proofErr w:type="gramStart"/>
-      <w:r>
-        <w:t>Pero</w:t>
-      </w:r>
-      <w:proofErr w:type="gramEnd"/>
-      <w:r>
-        <w:t xml:space="preserve"> aun así, sentimos que les falta algo:</w:t>
+        <w:t>Las IAs actuales, como ChatGPT, son impresionantes: escriben código, redactan ensayos, responden exámenes y manejan cantidades colosales de información. Su Capacidad (C) estadística es enorme.</w:t>
+      </w:r>
+    </w:p>
+    <w:p>
+      <w:r>
+        <w:t>Pero aun así, sentimos que les falta algo:</w:t>
       </w:r>
     </w:p>
     <w:p>
@@ -254,7 +216,7 @@
     <w:p>
       <w:r>
         <w:pict w14:anchorId="66AB607C">
-          <v:rect id="_x0000_i1068" style="width:0;height:1.5pt" o:hralign="center" o:hrstd="t" o:hr="t" fillcolor="#a0a0a0" stroked="f"/>
+          <v:rect id="_x0000_i1026" style="width:0;height:1.5pt" o:hralign="center" o:hrstd="t" o:hr="t" fillcolor="#a0a0a0" stroked="f"/>
         </w:pict>
       </w:r>
     </w:p>
@@ -432,15 +394,7 @@
           <w:b/>
           <w:bCs/>
         </w:rPr>
-        <w:t>La inteligencia genuina —la que se adapta, transfiere y generaliza— solo emerge cuando el sistema tiene algo que perder (</w:t>
-      </w:r>
-      <w:proofErr w:type="spellStart"/>
-      <w:r>
-        <w:rPr>
-          <w:b/>
-          <w:bCs/>
-        </w:rPr>
-        <w:t>P</w:t>
+        <w:t>La inteligencia genuina —la que se adapta, transfiere y generaliza— solo emerge cuando el sistema tiene algo que perder (P</w:t>
       </w:r>
       <w:r>
         <w:rPr>
@@ -457,7 +411,6 @@
         </w:rPr>
         <w:t>riesgo</w:t>
       </w:r>
-      <w:proofErr w:type="spellEnd"/>
       <w:r>
         <w:rPr>
           <w:rFonts w:ascii="Cambria Math" w:hAnsi="Cambria Math" w:cs="Cambria Math"/>
@@ -477,7 +430,7 @@
     <w:p>
       <w:r>
         <w:pict w14:anchorId="57A16A9C">
-          <v:rect id="_x0000_i1069" style="width:0;height:1.5pt" o:hralign="center" o:hrstd="t" o:hr="t" fillcolor="#a0a0a0" stroked="f"/>
+          <v:rect id="_x0000_i1027" style="width:0;height:1.5pt" o:hralign="center" o:hrstd="t" o:hr="t" fillcolor="#a0a0a0" stroked="f"/>
         </w:pict>
       </w:r>
     </w:p>
@@ -509,13 +462,8 @@
         </w:numPr>
       </w:pPr>
       <w:r>
-        <w:t xml:space="preserve">Si la IA tiene algo que perder (capacidad, continuidad, </w:t>
-      </w:r>
-      <w:proofErr w:type="gramStart"/>
-      <w:r>
-        <w:t>memoria)…</w:t>
-      </w:r>
-      <w:proofErr w:type="gramEnd"/>
+        <w:t>Si la IA tiene algo que perder (capacidad, continuidad, memoria)…</w:t>
+      </w:r>
     </w:p>
     <w:p>
       <w:pPr>
@@ -591,7 +539,7 @@
     <w:p>
       <w:r>
         <w:pict w14:anchorId="6683BC49">
-          <v:rect id="_x0000_i1070" style="width:0;height:1.5pt" o:hralign="center" o:hrstd="t" o:hr="t" fillcolor="#a0a0a0" stroked="f"/>
+          <v:rect id="_x0000_i1028" style="width:0;height:1.5pt" o:hralign="center" o:hrstd="t" o:hr="t" fillcolor="#a0a0a0" stroked="f"/>
         </w:pict>
       </w:r>
     </w:p>
@@ -735,7 +683,7 @@
     <w:p>
       <w:r>
         <w:pict w14:anchorId="66DB1FA6">
-          <v:rect id="_x0000_i1071" style="width:0;height:1.5pt" o:hralign="center" o:hrstd="t" o:hr="t" fillcolor="#a0a0a0" stroked="f"/>
+          <v:rect id="_x0000_i1029" style="width:0;height:1.5pt" o:hralign="center" o:hrstd="t" o:hr="t" fillcolor="#a0a0a0" stroked="f"/>
         </w:pict>
       </w:r>
     </w:p>
@@ -795,21 +743,12 @@
       <w:r>
         <w:t xml:space="preserve">, la IA optimiza un </w:t>
       </w:r>
-      <w:proofErr w:type="spellStart"/>
-      <w:r>
-        <w:rPr>
-          <w:b/>
-          <w:bCs/>
-        </w:rPr>
-        <w:t>Bundle</w:t>
-      </w:r>
-      <w:proofErr w:type="spellEnd"/>
-      <w:r>
-        <w:rPr>
-          <w:b/>
-          <w:bCs/>
-        </w:rPr>
-        <w:t xml:space="preserve"> Causal</w:t>
+      <w:r>
+        <w:rPr>
+          <w:b/>
+          <w:bCs/>
+        </w:rPr>
+        <w:t>Bundle Causal</w:t>
       </w:r>
       <w:r>
         <w:t>:</w:t>
@@ -863,7 +802,7 @@
     <w:p>
       <w:r>
         <w:pict w14:anchorId="7F5A090E">
-          <v:rect id="_x0000_i1072" style="width:0;height:1.5pt" o:hralign="center" o:hrstd="t" o:hr="t" fillcolor="#a0a0a0" stroked="f"/>
+          <v:rect id="_x0000_i1030" style="width:0;height:1.5pt" o:hralign="center" o:hrstd="t" o:hr="t" fillcolor="#a0a0a0" stroked="f"/>
         </w:pict>
       </w:r>
     </w:p>
@@ -928,17 +867,8 @@
           <w:b/>
           <w:bCs/>
         </w:rPr>
-        <w:t xml:space="preserve">El escenario </w:t>
-      </w:r>
-      <w:proofErr w:type="spellStart"/>
-      <w:r>
-        <w:rPr>
-          <w:b/>
-          <w:bCs/>
-        </w:rPr>
-        <w:t>Tamagotchi</w:t>
-      </w:r>
-      <w:proofErr w:type="spellEnd"/>
+        <w:t>El escenario Tamagotchi</w:t>
+      </w:r>
     </w:p>
     <w:p>
       <w:r>
@@ -1053,7 +983,7 @@
     <w:p>
       <w:r>
         <w:pict w14:anchorId="3C1A518D">
-          <v:rect id="_x0000_i1073" style="width:0;height:1.5pt" o:hralign="center" o:hrstd="t" o:hr="t" fillcolor="#a0a0a0" stroked="f"/>
+          <v:rect id="_x0000_i1031" style="width:0;height:1.5pt" o:hralign="center" o:hrstd="t" o:hr="t" fillcolor="#a0a0a0" stroked="f"/>
         </w:pict>
       </w:r>
     </w:p>
@@ -2528,6 +2458,7 @@
   <w:style w:type="character" w:default="1" w:styleId="DefaultParagraphFont">
     <w:name w:val="Default Paragraph Font"/>
     <w:uiPriority w:val="1"/>
+    <w:semiHidden/>
     <w:unhideWhenUsed/>
   </w:style>
   <w:style w:type="table" w:default="1" w:styleId="TableNormal">

</xml_diff>